<commit_message>
Add Cloone Corporation role starting Dec 2025
</commit_message>
<xml_diff>
--- a/Resume-MuhammadIzzatBinMohamadRizal.docx
+++ b/Resume-MuhammadIzzatBinMohamadRizal.docx
@@ -792,6 +792,16 @@
       </w:r>
     </w:p>
     <w:p>
+      <w:pPr/>
+      <w:r>
+        <w:t>Full Stack Senior Developer</w:t>
+        <w:tab/>
+        <w:t>December 2025 until present</w:t>
+        <w:tab/>
+        <w:t xml:space="preserve">Cloone Corporation Sdn Bhd  </w:t>
+      </w:r>
+    </w:p>
+    <w:p>
       <w:pPr>
         <w:spacing w:after="62"/>
         <w:ind w:left="384" w:right="17"/>
@@ -817,7 +827,7 @@
       </w:r>
       <w:proofErr w:type="gramEnd"/>
       <w:r>
-        <w:t xml:space="preserve">January 2023 until present Mahiran Digital </w:t>
+        <w:t xml:space="preserve">January 2023 until Nov 2025 Mahiran Digital </w:t>
       </w:r>
       <w:proofErr w:type="spellStart"/>
       <w:r>
@@ -932,7 +942,7 @@
       </w:r>
       <w:proofErr w:type="gramEnd"/>
       <w:r>
-        <w:t xml:space="preserve">August 2023 until present  </w:t>
+        <w:t xml:space="preserve">August 2023 until Nov 2025  </w:t>
       </w:r>
     </w:p>
     <w:p>
@@ -1081,7 +1091,7 @@
       </w:r>
       <w:proofErr w:type="gramEnd"/>
       <w:r>
-        <w:t xml:space="preserve">January 2023 until present  </w:t>
+        <w:t xml:space="preserve">January 2023 until Nov 2025  </w:t>
       </w:r>
     </w:p>
     <w:p>
@@ -1923,10 +1933,7 @@
         <w:ind w:right="17" w:hanging="360"/>
       </w:pPr>
       <w:r>
-        <w:t>Flutter, Postman, PHP</w:t>
-      </w:r>
-      <w:r>
-        <w:t>, Pusher</w:t>
+        <w:t xml:space="preserve">Flutter, Postman, PHP, Pusher</w:t>
       </w:r>
     </w:p>
     <w:p>
@@ -2653,16 +2660,7 @@
         <w:ind w:right="17" w:hanging="360"/>
       </w:pPr>
       <w:r>
-        <w:t xml:space="preserve">Mobile app system for student and </w:t>
-      </w:r>
-      <w:r>
-        <w:t>food seller and rider</w:t>
-      </w:r>
-      <w:r>
-        <w:t xml:space="preserve"> to </w:t>
-      </w:r>
-      <w:r>
-        <w:t>buy food, sell food, and deliver food around university campus</w:t>
+        <w:t xml:space="preserve">Mobile app system for student and food seller and rider to buy food, sell food, and deliver food around university campus</w:t>
       </w:r>
     </w:p>
     <w:p>
@@ -2724,10 +2722,7 @@
         <w:ind w:right="17" w:hanging="360"/>
       </w:pPr>
       <w:r>
-        <w:t xml:space="preserve">Flutter, </w:t>
-      </w:r>
-      <w:r>
-        <w:t>Pusher, Firebase Cloud Messaging</w:t>
+        <w:t xml:space="preserve">Flutter, Pusher, Firebase Cloud Messaging</w:t>
       </w:r>
     </w:p>
     <w:p>
@@ -3311,13 +3306,7 @@
         <w:ind w:left="355"/>
       </w:pPr>
       <w:r>
-        <w:t xml:space="preserve">Fire </w:t>
-      </w:r>
-      <w:r>
-        <w:t>Audit</w:t>
-      </w:r>
-      <w:r>
-        <w:t xml:space="preserve">  </w:t>
+        <w:t xml:space="preserve">Fire Audit  </w:t>
       </w:r>
     </w:p>
     <w:p>
@@ -3329,19 +3318,7 @@
         <w:ind w:right="17" w:hanging="360"/>
       </w:pPr>
       <w:r>
-        <w:t>Mobile app system for fire</w:t>
-      </w:r>
-      <w:r>
-        <w:t xml:space="preserve"> contractor and building owner</w:t>
-      </w:r>
-      <w:r>
-        <w:t xml:space="preserve"> to service and keep record tracking of fire extinguisher</w:t>
-      </w:r>
-      <w:r>
-        <w:t xml:space="preserve"> and fire equipment system</w:t>
-      </w:r>
-      <w:r>
-        <w:t xml:space="preserve"> using NFC and OCR Image</w:t>
+        <w:t xml:space="preserve">Mobile app system for fire contractor and building owner to service and keep record tracking of fire extinguisher and fire equipment system using NFC and OCR Image</w:t>
       </w:r>
       <w:r>
         <w:rPr>
@@ -3739,6 +3716,9 @@
       <w:footerReference w:type="even" r:id="rId18"/>
       <w:footerReference w:type="default" r:id="rId19"/>
       <w:footerReference w:type="first" r:id="rId20"/>
+      <w:headerReference w:type="default" r:id="rId23"/>
+      <w:headerReference w:type="first" r:id="rId24"/>
+      <w:headerReference w:type="even" r:id="rId25"/>
       <w:pgSz w:w="12240" w:h="15840"/>
       <w:pgMar w:top="1447" w:right="1352" w:bottom="1734" w:left="1426" w:header="720" w:footer="742" w:gutter="0"/>
       <w:cols w:space="720"/>
@@ -3894,6 +3874,36 @@
     </w:p>
   </w:footnote>
 </w:footnotes>
+</file>
+
+<file path=word/header1.xml><?xml version="1.0" encoding="utf-8"?>
+<w:hdr xmlns:m="http://schemas.openxmlformats.org/officeDocument/2006/math" xmlns:mc="http://schemas.openxmlformats.org/markup-compatibility/2006" xmlns:mo="http://schemas.microsoft.com/office/mac/office/2008/main" xmlns:mv="urn:schemas-microsoft-com:mac:vml" xmlns:o="urn:schemas-microsoft-com:office:office" xmlns:r="http://schemas.openxmlformats.org/officeDocument/2006/relationships" xmlns:v="urn:schemas-microsoft-com:vml" xmlns:w10="urn:schemas-microsoft-com:office:word" xmlns:w14="http://schemas.microsoft.com/office/word/2010/wordml" xmlns:w="http://schemas.openxmlformats.org/wordprocessingml/2006/main" xmlns:wne="http://schemas.microsoft.com/office/word/2006/wordml" xmlns:wp14="http://schemas.microsoft.com/office/word/2010/wordprocessingDrawing" xmlns:wp="http://schemas.openxmlformats.org/drawingml/2006/wordprocessingDrawing" xmlns:wpc="http://schemas.microsoft.com/office/word/2010/wordprocessingCanvas" xmlns:wpg="http://schemas.microsoft.com/office/word/2010/wordprocessingGroup" xmlns:wpi="http://schemas.microsoft.com/office/word/2010/wordprocessingInk" xmlns:wps="http://schemas.microsoft.com/office/word/2010/wordprocessingShape" mc:Ignorable="w14 wp14">
+  <w:p>
+    <w:pPr>
+      <w:pStyle w:val="Header"/>
+    </w:pPr>
+  </w:p>
+</w:hdr>
+</file>
+
+<file path=word/header2.xml><?xml version="1.0" encoding="utf-8"?>
+<w:hdr xmlns:m="http://schemas.openxmlformats.org/officeDocument/2006/math" xmlns:mc="http://schemas.openxmlformats.org/markup-compatibility/2006" xmlns:mo="http://schemas.microsoft.com/office/mac/office/2008/main" xmlns:mv="urn:schemas-microsoft-com:mac:vml" xmlns:o="urn:schemas-microsoft-com:office:office" xmlns:r="http://schemas.openxmlformats.org/officeDocument/2006/relationships" xmlns:v="urn:schemas-microsoft-com:vml" xmlns:w10="urn:schemas-microsoft-com:office:word" xmlns:w14="http://schemas.microsoft.com/office/word/2010/wordml" xmlns:w="http://schemas.openxmlformats.org/wordprocessingml/2006/main" xmlns:wne="http://schemas.microsoft.com/office/word/2006/wordml" xmlns:wp14="http://schemas.microsoft.com/office/word/2010/wordprocessingDrawing" xmlns:wp="http://schemas.openxmlformats.org/drawingml/2006/wordprocessingDrawing" xmlns:wpc="http://schemas.microsoft.com/office/word/2010/wordprocessingCanvas" xmlns:wpg="http://schemas.microsoft.com/office/word/2010/wordprocessingGroup" xmlns:wpi="http://schemas.microsoft.com/office/word/2010/wordprocessingInk" xmlns:wps="http://schemas.microsoft.com/office/word/2010/wordprocessingShape" mc:Ignorable="w14 wp14">
+  <w:p>
+    <w:pPr>
+      <w:pStyle w:val="Header"/>
+    </w:pPr>
+  </w:p>
+</w:hdr>
+</file>
+
+<file path=word/header3.xml><?xml version="1.0" encoding="utf-8"?>
+<w:hdr xmlns:m="http://schemas.openxmlformats.org/officeDocument/2006/math" xmlns:mc="http://schemas.openxmlformats.org/markup-compatibility/2006" xmlns:mo="http://schemas.microsoft.com/office/mac/office/2008/main" xmlns:mv="urn:schemas-microsoft-com:mac:vml" xmlns:o="urn:schemas-microsoft-com:office:office" xmlns:r="http://schemas.openxmlformats.org/officeDocument/2006/relationships" xmlns:v="urn:schemas-microsoft-com:vml" xmlns:w10="urn:schemas-microsoft-com:office:word" xmlns:w14="http://schemas.microsoft.com/office/word/2010/wordml" xmlns:w="http://schemas.openxmlformats.org/wordprocessingml/2006/main" xmlns:wne="http://schemas.microsoft.com/office/word/2006/wordml" xmlns:wp14="http://schemas.microsoft.com/office/word/2010/wordprocessingDrawing" xmlns:wp="http://schemas.openxmlformats.org/drawingml/2006/wordprocessingDrawing" xmlns:wpc="http://schemas.microsoft.com/office/word/2010/wordprocessingCanvas" xmlns:wpg="http://schemas.microsoft.com/office/word/2010/wordprocessingGroup" xmlns:wpi="http://schemas.microsoft.com/office/word/2010/wordprocessingInk" xmlns:wps="http://schemas.microsoft.com/office/word/2010/wordprocessingShape" mc:Ignorable="w14 wp14">
+  <w:p>
+    <w:pPr>
+      <w:pStyle w:val="Header"/>
+    </w:pPr>
+  </w:p>
+</w:hdr>
 </file>
 
 <file path=word/numbering.xml><?xml version="1.0" encoding="utf-8"?>

</xml_diff>

<commit_message>
Add bullet points under Full Stack Senior Developer in docx
</commit_message>
<xml_diff>
--- a/Resume-MuhammadIzzatBinMohamadRizal.docx
+++ b/Resume-MuhammadIzzatBinMohamadRizal.docx
@@ -799,6 +799,30 @@
         <w:t>December 2025 until present</w:t>
         <w:tab/>
         <w:t xml:space="preserve">Cloone Corporation Sdn Bhd  </w:t>
+      </w:r>
+    </w:p>
+    <w:p>
+      <w:pPr/>
+      <w:r>
+        <w:t>Involved in both web and mobile application development</w:t>
+      </w:r>
+    </w:p>
+    <w:p>
+      <w:pPr/>
+      <w:r>
+        <w:t>Collaborate with the team on feature delivery and code review</w:t>
+      </w:r>
+    </w:p>
+    <w:p>
+      <w:pPr/>
+      <w:r>
+        <w:t>Deploy and maintain staging/production environments</w:t>
+      </w:r>
+    </w:p>
+    <w:p>
+      <w:pPr/>
+      <w:r>
+        <w:t>Maintain code quality and code architecture</w:t>
       </w:r>
     </w:p>
     <w:p>

</xml_diff>